<commit_message>
Laudo 03 - Regularizacao
</commit_message>
<xml_diff>
--- a/uploads/Regularizacao_03.docx
+++ b/uploads/Regularizacao_03.docx
@@ -254,7 +254,7 @@
           <w:szCs w:val="24"/>
           <w:lang w:val="pt-BR"/>
         </w:rPr>
-        <w:t xml:space="preserve">0000</w:t>
+        <w:t xml:space="preserve">00000.0.035926/2026</w:t>
       </w:r>
     </w:p>
     <w:p>
@@ -287,7 +287,7 @@
           <w:szCs w:val="24"/>
           <w:lang w:val="pt-BR"/>
         </w:rPr>
-        <w:t xml:space="preserve">Cohab São Gonçalo </w:t>
+        <w:t xml:space="preserve">Pedregal</w:t>
       </w:r>
     </w:p>
     <w:p>
@@ -320,7 +320,7 @@
           <w:szCs w:val="24"/>
           <w:lang w:val="pt-BR"/>
         </w:rPr>
-        <w:t xml:space="preserve">Rua D,Quadra 40 - Casa 15</w:t>
+        <w:t xml:space="preserve">Rua João F de Souza</w:t>
       </w:r>
     </w:p>
     <w:p>
@@ -353,7 +353,7 @@
           <w:szCs w:val="24"/>
           <w:lang w:val="pt-BR"/>
         </w:rPr>
-        <w:t xml:space="preserve">-15.646262</w:t>
+        <w:t xml:space="preserve">-15.594828</w:t>
       </w:r>
       <w:r>
         <w:rPr>
@@ -371,7 +371,7 @@
           <w:szCs w:val="24"/>
           <w:lang w:val="pt-BR"/>
         </w:rPr>
-        <w:t xml:space="preserve"> -56.041388</w:t>
+        <w:t xml:space="preserve"> -56.069671</w:t>
       </w:r>
       <w:r>
         <w:rPr>
@@ -526,7 +526,7 @@
           <w:szCs w:val="24"/>
           <w:lang w:val="pt-BR"/>
         </w:rPr>
-        <w:t xml:space="preserve">Rua D,Quadra 40 - Casa 15</w:t>
+        <w:t xml:space="preserve">Rua João F de Souza</w:t>
       </w:r>
       <w:r>
         <w:rPr>
@@ -582,7 +582,7 @@
           <w:szCs w:val="24"/>
           <w:lang w:val="pt-BR" w:eastAsia="pt-BR"/>
         </w:rPr>
-        <w:t xml:space="preserve">Cohab São Gonçalo </w:t>
+        <w:t xml:space="preserve">Pedregal</w:t>
       </w:r>
       <w:r>
         <w:rPr>
@@ -626,7 +626,7 @@
           <w:szCs w:val="24"/>
           <w:lang w:val="pt-BR" w:eastAsia="pt-BR"/>
         </w:rPr>
-        <w:t xml:space="preserve">-56.041388</w:t>
+        <w:t xml:space="preserve">-56.069671</w:t>
       </w:r>
       <w:r>
         <w:rPr>
@@ -670,7 +670,7 @@
           <w:szCs w:val="24"/>
           <w:lang w:val="pt-BR" w:eastAsia="pt-BR"/>
         </w:rPr>
-        <w:t xml:space="preserve">-15.646262”</w:t>
+        <w:t xml:space="preserve">-15.594828”</w:t>
       </w:r>
       <w:r>
         <w:rPr>
@@ -953,7 +953,7 @@
           <w:szCs w:val="24"/>
           <w:lang w:val="pt-BR" w:eastAsia="pt-BR"/>
         </w:rPr>
-        <w:t xml:space="preserve"> Cohab São Gonçalo , </w:t>
+        <w:t xml:space="preserve"> Pedregal, </w:t>
       </w:r>
       <w:r>
         <w:rPr>
@@ -973,7 +973,7 @@
           <w:szCs w:val="24"/>
           <w:lang w:val="pt-BR" w:eastAsia="pt-BR"/>
         </w:rPr>
-        <w:t xml:space="preserve">Rua D,Quadra 40 - Casa 15.</w:t>
+        <w:t xml:space="preserve">Rua João F de Souza.</w:t>
       </w:r>
     </w:p>
     <w:p>
@@ -1132,7 +1132,7 @@
           <w:szCs w:val="24"/>
           <w:lang w:val="pt-BR" w:eastAsia="pt-BR"/>
         </w:rPr>
-        <w:t xml:space="preserve">0000</w:t>
+        <w:t xml:space="preserve">00000.0.035926/2026</w:t>
       </w:r>
       <w:r>
         <w:rPr>
@@ -1174,7 +1174,7 @@
           <w:szCs w:val="24"/>
           <w:lang w:val="pt-BR" w:eastAsia="pt-BR"/>
         </w:rPr>
-        <w:t xml:space="preserve"> Geotecnologia Ltda., inscrita no CNPJ 14.116.583/0001-60, regularmente contratada para realizar a regularização fundiária urbana do núcleo urbano informal consolidado, denominado Cohab São Gonçalo . </w:t>
+        <w:t xml:space="preserve"> Geotecnologia Ltda., inscrita no CNPJ 14.116.583/0001-60, regularmente contratada para realizar a regularização fundiária urbana do núcleo urbano informal consolidado, denominado Pedregal. </w:t>
       </w:r>
     </w:p>
     <w:p>
@@ -1363,7 +1363,7 @@
           <w:szCs w:val="24"/>
           <w:lang w:val="pt-BR" w:eastAsia="pt-BR"/>
         </w:rPr>
-        <w:t xml:space="preserve">15/01/2026</w:t>
+        <w:t xml:space="preserve">05/03/2026</w:t>
       </w:r>
       <w:r>
         <w:rPr>
@@ -1383,7 +1383,7 @@
           <w:szCs w:val="24"/>
           <w:lang w:val="pt-BR" w:eastAsia="pt-BR"/>
         </w:rPr>
-        <w:t xml:space="preserve">Rua D,Quadra 40 - Casa 15</w:t>
+        <w:t xml:space="preserve">Rua João F de Souza</w:t>
       </w:r>
       <w:r>
         <w:rPr>
@@ -1403,7 +1403,7 @@
           <w:szCs w:val="24"/>
           <w:lang w:val="pt-BR" w:eastAsia="pt-BR"/>
         </w:rPr>
-        <w:t xml:space="preserve">Cohab São Gonçalo </w:t>
+        <w:t xml:space="preserve">Pedregal</w:t>
       </w:r>
       <w:r>
         <w:rPr>
@@ -1423,7 +1423,7 @@
           <w:szCs w:val="24"/>
           <w:lang w:val="pt-BR" w:eastAsia="pt-BR"/>
         </w:rPr>
-        <w:t xml:space="preserve">0000</w:t>
+        <w:t xml:space="preserve">00000.0.035926/2026</w:t>
       </w:r>
       <w:r>
         <w:rPr>
@@ -1725,43 +1725,6 @@
         </w:rPr>
         <w:t xml:space="preserve"/>
       </w:r>
-      <w:r>
-        <w:drawing>
-          <wp:inline xmlns:a="http://schemas.openxmlformats.org/drawingml/2006/main" xmlns:pic="http://schemas.openxmlformats.org/drawingml/2006/picture">
-            <wp:extent cx="3600000" cy="2700000"/>
-            <wp:docPr id="1002" name="Picture 1"/>
-            <wp:cNvGraphicFramePr>
-              <a:graphicFrameLocks noChangeAspect="1"/>
-            </wp:cNvGraphicFramePr>
-            <a:graphic>
-              <a:graphicData uri="http://schemas.openxmlformats.org/drawingml/2006/picture">
-                <pic:pic>
-                  <pic:nvPicPr>
-                    <pic:cNvPr id="0" name="regularizacao_img2_03.jpg"/>
-                    <pic:cNvPicPr/>
-                  </pic:nvPicPr>
-                  <pic:blipFill>
-                    <a:blip r:embed="rId14"/>
-                    <a:stretch>
-                      <a:fillRect/>
-                    </a:stretch>
-                  </pic:blipFill>
-                  <pic:spPr>
-                    <a:xfrm>
-                      <a:off x="0" y="0"/>
-                      <a:ext cx="3600000" cy="2700000"/>
-                    </a:xfrm>
-                    <a:prstGeom prst="rect"/>
-                  </pic:spPr>
-                </pic:pic>
-              </a:graphicData>
-            </a:graphic>
-          </wp:inline>
-        </w:drawing>
-      </w:r>
-      <w:r>
-        <w:t xml:space="preserve"/>
-      </w:r>
     </w:p>
     <w:p>
       <w:pPr>
@@ -1780,7 +1743,7 @@
           <w:szCs w:val="20"/>
           <w:lang w:val="pt-BR"/>
         </w:rPr>
-        <w:t xml:space="preserve">Figura 02. Fachada </w:t>
+        <w:t xml:space="preserve">Figura 02. </w:t>
       </w:r>
     </w:p>
     <w:p>
@@ -1803,43 +1766,6 @@
         <w:br/>
         <w:t xml:space="preserve"/>
       </w:r>
-      <w:r>
-        <w:drawing>
-          <wp:inline xmlns:a="http://schemas.openxmlformats.org/drawingml/2006/main" xmlns:pic="http://schemas.openxmlformats.org/drawingml/2006/picture">
-            <wp:extent cx="3600000" cy="2700000"/>
-            <wp:docPr id="1003" name="Picture 1"/>
-            <wp:cNvGraphicFramePr>
-              <a:graphicFrameLocks noChangeAspect="1"/>
-            </wp:cNvGraphicFramePr>
-            <a:graphic>
-              <a:graphicData uri="http://schemas.openxmlformats.org/drawingml/2006/picture">
-                <pic:pic>
-                  <pic:nvPicPr>
-                    <pic:cNvPr id="0" name="regularizacao_img3_03.jpg"/>
-                    <pic:cNvPicPr/>
-                  </pic:nvPicPr>
-                  <pic:blipFill>
-                    <a:blip r:embed="rId15"/>
-                    <a:stretch>
-                      <a:fillRect/>
-                    </a:stretch>
-                  </pic:blipFill>
-                  <pic:spPr>
-                    <a:xfrm>
-                      <a:off x="0" y="0"/>
-                      <a:ext cx="3600000" cy="2700000"/>
-                    </a:xfrm>
-                    <a:prstGeom prst="rect"/>
-                  </pic:spPr>
-                </pic:pic>
-              </a:graphicData>
-            </a:graphic>
-          </wp:inline>
-        </w:drawing>
-      </w:r>
-      <w:r>
-        <w:t xml:space="preserve"/>
-      </w:r>
     </w:p>
     <w:p>
       <w:pPr>
@@ -1858,7 +1784,7 @@
           <w:szCs w:val="20"/>
           <w:lang w:val="pt-BR"/>
         </w:rPr>
-        <w:t xml:space="preserve">Figura 03. Detalhe </w:t>
+        <w:t xml:space="preserve">Figura 03. </w:t>
       </w:r>
     </w:p>
     <w:p>
@@ -1891,43 +1817,6 @@
         </w:rPr>
         <w:t xml:space="preserve"/>
       </w:r>
-      <w:r>
-        <w:drawing>
-          <wp:inline xmlns:a="http://schemas.openxmlformats.org/drawingml/2006/main" xmlns:pic="http://schemas.openxmlformats.org/drawingml/2006/picture">
-            <wp:extent cx="3600000" cy="2700000"/>
-            <wp:docPr id="1004" name="Picture 1"/>
-            <wp:cNvGraphicFramePr>
-              <a:graphicFrameLocks noChangeAspect="1"/>
-            </wp:cNvGraphicFramePr>
-            <a:graphic>
-              <a:graphicData uri="http://schemas.openxmlformats.org/drawingml/2006/picture">
-                <pic:pic>
-                  <pic:nvPicPr>
-                    <pic:cNvPr id="0" name="regularizacao_img4_03.jpg"/>
-                    <pic:cNvPicPr/>
-                  </pic:nvPicPr>
-                  <pic:blipFill>
-                    <a:blip r:embed="rId16"/>
-                    <a:stretch>
-                      <a:fillRect/>
-                    </a:stretch>
-                  </pic:blipFill>
-                  <pic:spPr>
-                    <a:xfrm>
-                      <a:off x="0" y="0"/>
-                      <a:ext cx="3600000" cy="2700000"/>
-                    </a:xfrm>
-                    <a:prstGeom prst="rect"/>
-                  </pic:spPr>
-                </pic:pic>
-              </a:graphicData>
-            </a:graphic>
-          </wp:inline>
-        </w:drawing>
-      </w:r>
-      <w:r>
-        <w:t xml:space="preserve"/>
-      </w:r>
     </w:p>
     <w:p>
       <w:pPr>
@@ -1946,7 +1835,7 @@
           <w:szCs w:val="20"/>
           <w:lang w:val="pt-BR"/>
         </w:rPr>
-        <w:t xml:space="preserve">Figura 04. Detalhe </w:t>
+        <w:t xml:space="preserve">Figura 04. </w:t>
       </w:r>
     </w:p>
     <w:p>
@@ -1969,43 +1858,6 @@
         <w:br/>
         <w:t xml:space="preserve"/>
       </w:r>
-      <w:r>
-        <w:drawing>
-          <wp:inline xmlns:a="http://schemas.openxmlformats.org/drawingml/2006/main" xmlns:pic="http://schemas.openxmlformats.org/drawingml/2006/picture">
-            <wp:extent cx="3600000" cy="2700000"/>
-            <wp:docPr id="1005" name="Picture 1"/>
-            <wp:cNvGraphicFramePr>
-              <a:graphicFrameLocks noChangeAspect="1"/>
-            </wp:cNvGraphicFramePr>
-            <a:graphic>
-              <a:graphicData uri="http://schemas.openxmlformats.org/drawingml/2006/picture">
-                <pic:pic>
-                  <pic:nvPicPr>
-                    <pic:cNvPr id="0" name="regularizacao_img5_03.jpg"/>
-                    <pic:cNvPicPr/>
-                  </pic:nvPicPr>
-                  <pic:blipFill>
-                    <a:blip r:embed="rId17"/>
-                    <a:stretch>
-                      <a:fillRect/>
-                    </a:stretch>
-                  </pic:blipFill>
-                  <pic:spPr>
-                    <a:xfrm>
-                      <a:off x="0" y="0"/>
-                      <a:ext cx="3600000" cy="2700000"/>
-                    </a:xfrm>
-                    <a:prstGeom prst="rect"/>
-                  </pic:spPr>
-                </pic:pic>
-              </a:graphicData>
-            </a:graphic>
-          </wp:inline>
-        </w:drawing>
-      </w:r>
-      <w:r>
-        <w:t xml:space="preserve"/>
-      </w:r>
     </w:p>
     <w:p>
       <w:pPr>
@@ -2024,7 +1876,7 @@
           <w:szCs w:val="20"/>
           <w:lang w:val="pt-BR"/>
         </w:rPr>
-        <w:t xml:space="preserve">Figura 05. Detalhe </w:t>
+        <w:t xml:space="preserve">Figura 05. </w:t>
       </w:r>
     </w:p>
     <w:p>
@@ -2290,7 +2142,7 @@
           <w:sz w:val="24"/>
           <w:lang w:val="pt-BR"/>
         </w:rPr>
-        <w:t xml:space="preserve">MÉDIO</w:t>
+        <w:t xml:space="preserve">BAIXO</w:t>
       </w:r>
       <w:r>
         <w:rPr>
@@ -2653,7 +2505,7 @@
           <w:szCs w:val="18"/>
           <w:lang w:val="pt-BR"/>
         </w:rPr>
-        <w:t xml:space="preserve">Cuiabá/MT, 15 de janeiro de 2026</w:t>
+        <w:t xml:space="preserve">Cuiabá/MT, 05/03/2026</w:t>
       </w:r>
     </w:p>
     <w:p>

</xml_diff>